<commit_message>
Fix brandbook issues found in review, add PCB pattern section to variant 2
Both variants: orange CMYK recomputed through an ICC profile (0/64/100/0),
DLKIP sign and its files marked as pending the logo stage in variant 1,
grammar fix. Variant 2: own proposals marked for approval, unsupported
claims removed, contrast rules made consistent with the palette, black logo
on orange, clear space for the short logo, consistent colour names.

Co-Authored-By: Claude Opus 5.5 <noreply@anthropic.com>
Claude-Session: https://claude.ai/code/session_01V2FjruK1JeG3yk1AXHn97V
</commit_message>
<xml_diff>
--- a/dlkip_brandbook/out/40'0'0 БРЕНДБУК DLKIP (вариант 1 - как у Домалогики).docx
+++ b/dlkip_brandbook/out/40'0'0 БРЕНДБУК DLKIP (вариант 1 - как у Домалогики).docx
@@ -1141,7 +1141,7 @@
           <w:rFonts w:ascii="Times New Roman" w:cs="Times New Roman" w:eastAsia="Times New Roman" w:hAnsi="Times New Roman"/>
           <w:rtl w:val="0"/>
         </w:rPr>
-        <w:t xml:space="preserve">CMYK: 0, 48, 100, 6</w:t>
+        <w:t xml:space="preserve">CMYK: 0, 64, 100, 0</w:t>
       </w:r>
     </w:p>
     <w:p>
@@ -4326,7 +4326,7 @@
           <w:bCs w:val="1"/>
           <w:rtl w:val="0"/>
         </w:rPr>
-        <w:t xml:space="preserve">Фирменная надпись DLKIP ELECTRONICS</w:t>
+        <w:t xml:space="preserve">Шрифт логотипа: [уточнить]</w:t>
       </w:r>
     </w:p>
     <w:p>
@@ -6595,7 +6595,7 @@
           <w:rFonts w:ascii="Times New Roman" w:cs="Times New Roman" w:eastAsia="Times New Roman" w:hAnsi="Times New Roman"/>
           <w:rtl w:val="0"/>
         </w:rPr>
-        <w:t xml:space="preserve">Состав: Графический знак (иконка печатной платы) + полное название DLKIP ELECTRONICS</w:t>
+        <w:t xml:space="preserve">Состав: Графический знак [разрабатывается на этапе «Логотип»] + полное название DLKIP ELECTRONICS</w:t>
       </w:r>
     </w:p>
     <w:p>
@@ -6655,7 +6655,7 @@
           <w:rFonts w:ascii="Times New Roman" w:cs="Times New Roman" w:eastAsia="Times New Roman" w:hAnsi="Times New Roman"/>
           <w:rtl w:val="0"/>
         </w:rPr>
-        <w:t xml:space="preserve">Форматы файлов: 1.ai, 1.eps, 1.cdr</w:t>
+        <w:t xml:space="preserve">Форматы файлов: .ai, .eps, .cdr — после этапа «Логотип»</w:t>
       </w:r>
     </w:p>
     <w:p>
@@ -6754,7 +6754,7 @@
           <w:rFonts w:ascii="Times New Roman" w:cs="Times New Roman" w:eastAsia="Times New Roman" w:hAnsi="Times New Roman"/>
           <w:rtl w:val="0"/>
         </w:rPr>
-        <w:t xml:space="preserve">Форматы файлов: 2.ai, 2.eps</w:t>
+        <w:t xml:space="preserve">Форматы файлов: .ai, .eps — после этапа «Логотип»</w:t>
       </w:r>
     </w:p>
     <w:p>
@@ -6793,7 +6793,7 @@
           <w:rFonts w:ascii="Times New Roman" w:cs="Times New Roman" w:eastAsia="Times New Roman" w:hAnsi="Times New Roman"/>
           <w:rtl w:val="0"/>
         </w:rPr>
-        <w:t xml:space="preserve">Состав: Только иконка печатной платы без текста</w:t>
+        <w:t xml:space="preserve">Состав: Только графический знак без текста [разрабатывается на этапе «Логотип»]</w:t>
       </w:r>
     </w:p>
     <w:p>
@@ -11169,7 +11169,7 @@
           <w:rFonts w:ascii="Times New Roman" w:cs="Times New Roman" w:eastAsia="Times New Roman" w:hAnsi="Times New Roman"/>
           <w:rtl w:val="0"/>
         </w:rPr>
-        <w:t xml:space="preserve">Посты: .PSD (Photoshop), .AI (Illustrator) с слоями</w:t>
+        <w:t xml:space="preserve">Посты: .PSD (Photoshop), .AI (Illustrator) со слоями</w:t>
       </w:r>
     </w:p>
     <w:p>

</xml_diff>

<commit_message>
Fill brandbook variant 1 with client's company texts, add slogan to logos
Co-Authored-By: Claude Opus 5.5 <noreply@anthropic.com>
Claude-Session: https://claude.ai/code/session_01V2FjruK1JeG3yk1AXHn97V
</commit_message>
<xml_diff>
--- a/dlkip_brandbook/out/40'0'0 БРЕНДБУК DLKIP (вариант 1 - как у Домалогики).docx
+++ b/dlkip_brandbook/out/40'0'0 БРЕНДБУК DLKIP (вариант 1 - как у Домалогики).docx
@@ -568,210 +568,22 @@
           <w:rFonts w:ascii="Times New Roman" w:cs="Times New Roman" w:eastAsia="Times New Roman" w:hAnsi="Times New Roman"/>
           <w:rtl w:val="0"/>
         </w:rPr>
-        <w:t xml:space="preserve">Основные сведения</w:t>
-      </w:r>
-    </w:p>
-    <w:p>
-      <w:pPr>
-        <w:numPr>
-          <w:ilvl w:val="0"/>
-          <w:numId w:val="301"/>
-        </w:numPr>
-        <w:spacing w:after="0" w:before="240" w:lineRule="auto"/>
-        <w:ind w:left="720" w:hanging="360"/>
-        <w:rPr>
-          <w:rFonts w:ascii="Times New Roman" w:cs="Times New Roman" w:eastAsia="Times New Roman" w:hAnsi="Times New Roman"/>
-        </w:rPr>
-      </w:pPr>
-      <w:r>
-        <w:rPr>
-          <w:rFonts w:ascii="Times New Roman" w:cs="Times New Roman" w:eastAsia="Times New Roman" w:hAnsi="Times New Roman"/>
-          <w:b w:val="1"/>
-          <w:bCs w:val="1"/>
-          <w:rtl w:val="0"/>
-        </w:rPr>
-        <w:t xml:space="preserve">Название:</w:t>
-      </w:r>
-      <w:r>
-        <w:rPr>
-          <w:rFonts w:ascii="Times New Roman" w:cs="Times New Roman" w:eastAsia="Times New Roman" w:hAnsi="Times New Roman"/>
-          <w:rtl w:val="0"/>
-        </w:rPr>
-        <w:t xml:space="preserve"> DLKIP Electronics (ООО СП «ДЛКИП»)</w:t>
-      </w:r>
-    </w:p>
-    <w:p>
-      <w:pPr>
-        <w:numPr>
-          <w:ilvl w:val="0"/>
-          <w:numId w:val="301"/>
-        </w:numPr>
-        <w:spacing w:after="0" w:before="0" w:lineRule="auto"/>
-        <w:ind w:left="720" w:hanging="360"/>
-        <w:rPr>
-          <w:rFonts w:ascii="Times New Roman" w:cs="Times New Roman" w:eastAsia="Times New Roman" w:hAnsi="Times New Roman"/>
-        </w:rPr>
-      </w:pPr>
-      <w:r>
-        <w:rPr>
-          <w:rFonts w:ascii="Times New Roman" w:cs="Times New Roman" w:eastAsia="Times New Roman" w:hAnsi="Times New Roman"/>
-          <w:b w:val="1"/>
-          <w:bCs w:val="1"/>
-          <w:rtl w:val="0"/>
-        </w:rPr>
-        <w:t xml:space="preserve">Город:</w:t>
-      </w:r>
-      <w:r>
-        <w:rPr>
-          <w:rFonts w:ascii="Times New Roman" w:cs="Times New Roman" w:eastAsia="Times New Roman" w:hAnsi="Times New Roman"/>
-          <w:rtl w:val="0"/>
-        </w:rPr>
-        <w:t xml:space="preserve"> Ташкент, Узбекистан</w:t>
-      </w:r>
-    </w:p>
-    <w:p>
-      <w:pPr>
-        <w:numPr>
-          <w:ilvl w:val="0"/>
-          <w:numId w:val="301"/>
-        </w:numPr>
-        <w:spacing w:after="0" w:before="0" w:lineRule="auto"/>
-        <w:ind w:left="720" w:hanging="360"/>
-        <w:rPr>
-          <w:rFonts w:ascii="Times New Roman" w:cs="Times New Roman" w:eastAsia="Times New Roman" w:hAnsi="Times New Roman"/>
-        </w:rPr>
-      </w:pPr>
-      <w:r>
-        <w:rPr>
-          <w:rFonts w:ascii="Times New Roman" w:cs="Times New Roman" w:eastAsia="Times New Roman" w:hAnsi="Times New Roman"/>
-          <w:b w:val="1"/>
-          <w:bCs w:val="1"/>
-          <w:rtl w:val="0"/>
-        </w:rPr>
-        <w:t xml:space="preserve">Работает с:</w:t>
-      </w:r>
-      <w:r>
-        <w:rPr>
-          <w:rFonts w:ascii="Times New Roman" w:cs="Times New Roman" w:eastAsia="Times New Roman" w:hAnsi="Times New Roman"/>
-          <w:rtl w:val="0"/>
-        </w:rPr>
-        <w:t xml:space="preserve"> 2015 года</w:t>
-      </w:r>
-    </w:p>
-    <w:p>
-      <w:pPr>
-        <w:numPr>
-          <w:ilvl w:val="0"/>
-          <w:numId w:val="301"/>
-        </w:numPr>
-        <w:spacing w:after="0" w:before="0" w:lineRule="auto"/>
-        <w:ind w:left="720" w:hanging="360"/>
-        <w:rPr>
-          <w:rFonts w:ascii="Times New Roman" w:cs="Times New Roman" w:eastAsia="Times New Roman" w:hAnsi="Times New Roman"/>
-        </w:rPr>
-      </w:pPr>
-      <w:r>
-        <w:rPr>
-          <w:rFonts w:ascii="Times New Roman" w:cs="Times New Roman" w:eastAsia="Times New Roman" w:hAnsi="Times New Roman"/>
-          <w:b w:val="1"/>
-          <w:bCs w:val="1"/>
-          <w:rtl w:val="0"/>
-        </w:rPr>
-        <w:t xml:space="preserve">Деятельность:</w:t>
-      </w:r>
-      <w:r>
-        <w:rPr>
-          <w:rFonts w:ascii="Times New Roman" w:cs="Times New Roman" w:eastAsia="Times New Roman" w:hAnsi="Times New Roman"/>
-          <w:rtl w:val="0"/>
-        </w:rPr>
-        <w:t xml:space="preserve"> разработка и производство электронных устройств и промышленных датчиков</w:t>
-      </w:r>
-    </w:p>
-    <w:p>
-      <w:pPr>
-        <w:numPr>
-          <w:ilvl w:val="0"/>
-          <w:numId w:val="301"/>
-        </w:numPr>
-        <w:spacing w:after="0" w:before="0" w:lineRule="auto"/>
-        <w:ind w:left="720" w:hanging="360"/>
-        <w:rPr>
-          <w:rFonts w:ascii="Times New Roman" w:cs="Times New Roman" w:eastAsia="Times New Roman" w:hAnsi="Times New Roman"/>
-        </w:rPr>
-      </w:pPr>
-      <w:r>
-        <w:rPr>
-          <w:rFonts w:ascii="Times New Roman" w:cs="Times New Roman" w:eastAsia="Times New Roman" w:hAnsi="Times New Roman"/>
-          <w:b w:val="1"/>
-          <w:bCs w:val="1"/>
-          <w:rtl w:val="0"/>
-        </w:rPr>
-        <w:t xml:space="preserve">Продукция:</w:t>
-      </w:r>
-      <w:r>
-        <w:rPr>
-          <w:rFonts w:ascii="Times New Roman" w:cs="Times New Roman" w:eastAsia="Times New Roman" w:hAnsi="Times New Roman"/>
-          <w:rtl w:val="0"/>
-        </w:rPr>
-        <w:t xml:space="preserve"> более 200 моделей различных датчиков для промышленного сектора</w:t>
-      </w:r>
-    </w:p>
-    <w:p>
-      <w:pPr>
-        <w:numPr>
-          <w:ilvl w:val="0"/>
-          <w:numId w:val="301"/>
-        </w:numPr>
-        <w:spacing w:after="0" w:before="0" w:lineRule="auto"/>
-        <w:ind w:left="720" w:hanging="360"/>
-        <w:rPr>
-          <w:rFonts w:ascii="Times New Roman" w:cs="Times New Roman" w:eastAsia="Times New Roman" w:hAnsi="Times New Roman"/>
-        </w:rPr>
-      </w:pPr>
-      <w:r>
-        <w:rPr>
-          <w:rFonts w:ascii="Times New Roman" w:cs="Times New Roman" w:eastAsia="Times New Roman" w:hAnsi="Times New Roman"/>
-          <w:b w:val="1"/>
-          <w:bCs w:val="1"/>
-          <w:rtl w:val="0"/>
-        </w:rPr>
-        <w:t xml:space="preserve">Производство:</w:t>
-      </w:r>
-      <w:r>
-        <w:rPr>
-          <w:rFonts w:ascii="Times New Roman" w:cs="Times New Roman" w:eastAsia="Times New Roman" w:hAnsi="Times New Roman"/>
-          <w:rtl w:val="0"/>
-        </w:rPr>
-        <w:t xml:space="preserve"> собственное, с линией SMD монтажа и современным оборудованием</w:t>
-      </w:r>
-    </w:p>
-    <w:p>
-      <w:pPr>
-        <w:numPr>
-          <w:ilvl w:val="0"/>
-          <w:numId w:val="301"/>
-        </w:numPr>
-        <w:spacing w:after="240" w:before="0" w:lineRule="auto"/>
-        <w:ind w:left="720" w:hanging="360"/>
-        <w:rPr>
-          <w:rFonts w:ascii="Times New Roman" w:cs="Times New Roman" w:eastAsia="Times New Roman" w:hAnsi="Times New Roman"/>
-        </w:rPr>
-      </w:pPr>
-      <w:r>
-        <w:rPr>
-          <w:rFonts w:ascii="Times New Roman" w:cs="Times New Roman" w:eastAsia="Times New Roman" w:hAnsi="Times New Roman"/>
-          <w:b w:val="1"/>
-          <w:bCs w:val="1"/>
-          <w:rtl w:val="0"/>
-        </w:rPr>
-        <w:t xml:space="preserve">Клиенты:</w:t>
-      </w:r>
-      <w:r>
-        <w:rPr>
-          <w:rFonts w:ascii="Times New Roman" w:cs="Times New Roman" w:eastAsia="Times New Roman" w:hAnsi="Times New Roman"/>
-          <w:rtl w:val="0"/>
-        </w:rPr>
-        <w:t xml:space="preserve"> крупнейшие производственные предприятия Узбекистана, добывающие нефть, газ, золото, уран, медь</w:t>
+        <w:t xml:space="preserve">Общая информация</w:t>
+      </w:r>
+    </w:p>
+    <w:p>
+      <w:pPr>
+        <w:spacing w:after="240" w:before="240" w:lineRule="auto"/>
+        <w:rPr>
+          <w:rFonts w:ascii="Times New Roman" w:cs="Times New Roman" w:eastAsia="Times New Roman" w:hAnsi="Times New Roman"/>
+        </w:rPr>
+      </w:pPr>
+      <w:r>
+        <w:rPr>
+          <w:rFonts w:ascii="Times New Roman" w:cs="Times New Roman" w:eastAsia="Times New Roman" w:hAnsi="Times New Roman"/>
+          <w:rtl w:val="0"/>
+        </w:rPr>
+        <w:t xml:space="preserve">DLKIP Electronics — компания, специализирующаяся на разработке и производстве инновационных электронных устройств и компонентов для различных отраслей. Мы предлагаем решения, которые соответствуют самым высоким стандартам качества и надежности. Благодаря применению передовых технологий и автоматизированных процессов, мы обеспечиваем точность и долговечность нашей продукции на всех этапах — от проектирования и разработки до производства и поставки. Мы ориентированы на индивидуальный подход к каждому клиенту, что позволяет создавать решения, максимально соответствующие их потребностям. Компания активно развивает свои производственные мощности, стремясь предоставить высококачественные продукты, которые помогают оптимизировать бизнес-процессы и повысить конкурентоспособность наших партнеров на рынке.</w:t>
       </w:r>
     </w:p>
     <w:p>
@@ -791,7 +603,7 @@
           <w:rFonts w:ascii="Times New Roman" w:cs="Times New Roman" w:eastAsia="Times New Roman" w:hAnsi="Times New Roman"/>
           <w:rtl w:val="0"/>
         </w:rPr>
-        <w:t xml:space="preserve">История</w:t>
+        <w:t xml:space="preserve">История компании</w:t>
       </w:r>
     </w:p>
     <w:p>
@@ -806,7 +618,7 @@
           <w:rFonts w:ascii="Times New Roman" w:cs="Times New Roman" w:eastAsia="Times New Roman" w:hAnsi="Times New Roman"/>
           <w:rtl w:val="0"/>
         </w:rPr>
-        <w:t xml:space="preserve">DLKIP была создана путём объединения двух компаний: ведущего узбекского поставщика промышленных датчиков с более чем 7-летним опытом работы и российской R&amp;D компании-разработчика электроники с многолетним опытом разработки и серийного производства.</w:t>
+        <w:t xml:space="preserve">Компания DLKIP Electronics была основана в 2023 году как дочерняя компания ведущих компаний DOMALOGICA и МАНОКИПА. Мы начали свою деятельность с целью разработки и производства высококачественных электронных устройств и компонентов для различных отраслей. Объединяя опыт и знания материнских компаний, мы быстро заняли свою нишу на рынке, ориентируясь на инновации и высокие стандарты качества. С самого начала нашей работы мы стремились создавать продукцию, соответствующую самым строгим требованиям, внедряя передовые технологии и автоматизируя процессы. Эти принципы позволили нам обеспечивать надежность и точность на каждом этапе производства. Сегодня DLKIP Electronics — это динамично развивающаяся компания с репутацией надежного партнера, предлагающая решения для различных отраслей, которая продолжает двигаться вперед, расширяя свои возможности и внедряя инновации для удовлетворения потребностей клиентов.</w:t>
       </w:r>
     </w:p>
     <w:p>
@@ -826,7 +638,7 @@
           <w:rFonts w:ascii="Times New Roman" w:cs="Times New Roman" w:eastAsia="Times New Roman" w:hAnsi="Times New Roman"/>
           <w:rtl w:val="0"/>
         </w:rPr>
-        <w:t xml:space="preserve">Возможности</w:t>
+        <w:t xml:space="preserve">Учредители</w:t>
       </w:r>
     </w:p>
     <w:p>
@@ -841,7 +653,22 @@
           <w:rFonts w:ascii="Times New Roman" w:cs="Times New Roman" w:eastAsia="Times New Roman" w:hAnsi="Times New Roman"/>
           <w:rtl w:val="0"/>
         </w:rPr>
-        <w:t xml:space="preserve">Компания может создать любое устройство от идеи до серийного производства, обеспечивая внутренний рынок Узбекистана качественными, функциональными и современными датчиками с хорошим соотношением цена-качество.</w:t>
+        <w:t xml:space="preserve">Компания Domalogica — российский разработчик и производитель электроники из Дагестана, работающий с 2015 года. Мы обладаем опытом в разработке электронных устройств в различных областях. Наше современное производство расположено в России при этом российское производство находится на территории Дагестанского технического университета. В нашей команде работают высококвалифицированные специалисты, и компанией управляет генеральный директор Юсупанов Хасай. Мы проводим полный цикл разработки — от идеи до массового коммерческого производства.</w:t>
+      </w:r>
+    </w:p>
+    <w:p>
+      <w:pPr>
+        <w:spacing w:after="240" w:before="240" w:lineRule="auto"/>
+        <w:rPr>
+          <w:rFonts w:ascii="Times New Roman" w:cs="Times New Roman" w:eastAsia="Times New Roman" w:hAnsi="Times New Roman"/>
+        </w:rPr>
+      </w:pPr>
+      <w:r>
+        <w:rPr>
+          <w:rFonts w:ascii="Times New Roman" w:cs="Times New Roman" w:eastAsia="Times New Roman" w:hAnsi="Times New Roman"/>
+          <w:rtl w:val="0"/>
+        </w:rPr>
+        <w:t xml:space="preserve">Компания Manokip — крупнейший производитель манометров в Узбекистане, работающая с 2015 года.</w:t>
       </w:r>
     </w:p>
     <w:p>
@@ -861,6 +688,336 @@
           <w:rFonts w:ascii="Times New Roman" w:cs="Times New Roman" w:eastAsia="Times New Roman" w:hAnsi="Times New Roman"/>
           <w:rtl w:val="0"/>
         </w:rPr>
+        <w:t xml:space="preserve">Миссия компании</w:t>
+      </w:r>
+    </w:p>
+    <w:p>
+      <w:pPr>
+        <w:spacing w:after="240" w:before="240" w:lineRule="auto"/>
+        <w:rPr>
+          <w:rFonts w:ascii="Times New Roman" w:cs="Times New Roman" w:eastAsia="Times New Roman" w:hAnsi="Times New Roman"/>
+        </w:rPr>
+      </w:pPr>
+      <w:r>
+        <w:rPr>
+          <w:rFonts w:ascii="Times New Roman" w:cs="Times New Roman" w:eastAsia="Times New Roman" w:hAnsi="Times New Roman"/>
+          <w:rtl w:val="0"/>
+        </w:rPr>
+        <w:t xml:space="preserve">Миссия компании DLKIP Electronics — разрабатывать и производить высококачественные и инновационные электронные устройства, которые не только соответствуют современным стандартам, но и значительно улучшают жизнь людей. Мы ставим перед собой задачу создавать продукцию, которая отвечает самым строгим требованиям надежности, безопасности и функциональности, обеспечивая нашим клиентам конкурентные преимущества на рынке. Мы стремимся к постоянному совершенствованию технологий и производственных процессов, внедряя передовые разработки и автоматизацию на каждом этапе работы. Наши инженеры и специалисты постоянно ищут новые подходы и решения, чтобы создавать устройства, которые решают реальные задачи и повышают эффективность различных отраслей. Мы гордимся своим вкладом в развитие электроники и всегда нацелены на создание долгосрочных, взаимовыгодных партнерских отношений с клиентами, поставщиками и сотрудниками.</w:t>
+      </w:r>
+    </w:p>
+    <w:p>
+      <w:pPr>
+        <w:pStyle w:val="Heading2"/>
+        <w:keepNext/>
+        <w:spacing w:after="240" w:before="240" w:lineRule="auto"/>
+        <w:jc w:val="center"/>
+        <w:rPr>
+          <w:rFonts w:ascii="Times New Roman" w:cs="Times New Roman" w:eastAsia="Times New Roman" w:hAnsi="Times New Roman"/>
+        </w:rPr>
+      </w:pPr>
+      <w:bookmarkStart w:colFirst="0" w:colLast="0" w:name="_dlkip1006" w:id="1006"/>
+      <w:bookmarkEnd w:id="1006"/>
+      <w:r>
+        <w:rPr>
+          <w:rFonts w:ascii="Times New Roman" w:cs="Times New Roman" w:eastAsia="Times New Roman" w:hAnsi="Times New Roman"/>
+          <w:rtl w:val="0"/>
+        </w:rPr>
+        <w:t xml:space="preserve">Цель компании</w:t>
+      </w:r>
+    </w:p>
+    <w:p>
+      <w:pPr>
+        <w:spacing w:after="240" w:before="240" w:lineRule="auto"/>
+        <w:rPr>
+          <w:rFonts w:ascii="Times New Roman" w:cs="Times New Roman" w:eastAsia="Times New Roman" w:hAnsi="Times New Roman"/>
+        </w:rPr>
+      </w:pPr>
+      <w:r>
+        <w:rPr>
+          <w:rFonts w:ascii="Times New Roman" w:cs="Times New Roman" w:eastAsia="Times New Roman" w:hAnsi="Times New Roman"/>
+          <w:rtl w:val="0"/>
+        </w:rPr>
+        <w:t xml:space="preserve">Цель компании DLKIP Electronics — помочь нашим клиентам воплотить их идеи в реальность, предоставляя высококачественные и инновационные электронные решения, которые соответствуют самым высоким стандартам и требованиям отрасли. Мы стремимся быть не просто поставщиком, а надежным партнером, который активно участвует в процессе создания и реализации идей, обеспечивая полный цикл разработки и производства электронных устройств. Мы ставим перед собой задачу разрабатывать продукцию, которая помогает нашим клиентам достигать их целей, повышать конкурентоспособность и оптимизировать производственные процессы. Используя передовые технологии, современные методы автоматизации и глубокие знания в области электроники, мы создаем решения, которые помогают бизнесу расти и развиваться. Мы ориентированы на долгосрочные партнерские отношения, предоставляя нашим клиентам не только качественные продукты, но и высококлассную техническую поддержку, консультации и индивидуальный подход. Наша цель — это не просто создание устройств, а создание технологий, которые решают реальные проблемы и открывают новые возможности для наших клиентов.</w:t>
+      </w:r>
+    </w:p>
+    <w:p>
+      <w:pPr>
+        <w:pStyle w:val="Heading2"/>
+        <w:keepNext/>
+        <w:spacing w:after="240" w:before="240" w:lineRule="auto"/>
+        <w:jc w:val="center"/>
+        <w:rPr>
+          <w:rFonts w:ascii="Times New Roman" w:cs="Times New Roman" w:eastAsia="Times New Roman" w:hAnsi="Times New Roman"/>
+        </w:rPr>
+      </w:pPr>
+      <w:bookmarkStart w:colFirst="0" w:colLast="0" w:name="_dlkip1007" w:id="1007"/>
+      <w:bookmarkEnd w:id="1007"/>
+      <w:r>
+        <w:rPr>
+          <w:rFonts w:ascii="Times New Roman" w:cs="Times New Roman" w:eastAsia="Times New Roman" w:hAnsi="Times New Roman"/>
+          <w:rtl w:val="0"/>
+        </w:rPr>
+        <w:t xml:space="preserve">Слоган компании</w:t>
+      </w:r>
+    </w:p>
+    <w:p>
+      <w:pPr>
+        <w:keepNext/>
+        <w:spacing w:after="0" w:before="0" w:lineRule="auto"/>
+        <w:rPr>
+          <w:rFonts w:ascii="Times New Roman" w:cs="Times New Roman" w:eastAsia="Times New Roman" w:hAnsi="Times New Roman"/>
+          <w:b w:val="1"/>
+          <w:bCs w:val="1"/>
+        </w:rPr>
+      </w:pPr>
+      <w:r>
+        <w:rPr>
+          <w:rFonts w:ascii="Times New Roman" w:cs="Times New Roman" w:eastAsia="Times New Roman" w:hAnsi="Times New Roman"/>
+          <w:b w:val="1"/>
+          <w:bCs w:val="1"/>
+          <w:rtl w:val="0"/>
+        </w:rPr>
+        <w:t xml:space="preserve">Короткий</w:t>
+      </w:r>
+    </w:p>
+    <w:p>
+      <w:pPr>
+        <w:numPr>
+          <w:ilvl w:val="0"/>
+          <w:numId w:val="301"/>
+        </w:numPr>
+        <w:spacing w:after="0" w:before="0" w:lineRule="auto"/>
+        <w:ind w:left="720" w:hanging="360"/>
+        <w:rPr>
+          <w:rFonts w:ascii="Times New Roman" w:cs="Times New Roman" w:eastAsia="Times New Roman" w:hAnsi="Times New Roman"/>
+        </w:rPr>
+      </w:pPr>
+      <w:r>
+        <w:rPr>
+          <w:rFonts w:ascii="Times New Roman" w:cs="Times New Roman" w:eastAsia="Times New Roman" w:hAnsi="Times New Roman"/>
+          <w:rtl w:val="0"/>
+        </w:rPr>
+        <w:t xml:space="preserve">РУС: Мы превратим ваши идеи в реальность</w:t>
+      </w:r>
+    </w:p>
+    <w:p>
+      <w:pPr>
+        <w:numPr>
+          <w:ilvl w:val="0"/>
+          <w:numId w:val="301"/>
+        </w:numPr>
+        <w:spacing w:after="0" w:before="0" w:lineRule="auto"/>
+        <w:ind w:left="720" w:hanging="360"/>
+        <w:rPr>
+          <w:rFonts w:ascii="Times New Roman" w:cs="Times New Roman" w:eastAsia="Times New Roman" w:hAnsi="Times New Roman"/>
+        </w:rPr>
+      </w:pPr>
+      <w:r>
+        <w:rPr>
+          <w:rFonts w:ascii="Times New Roman" w:cs="Times New Roman" w:eastAsia="Times New Roman" w:hAnsi="Times New Roman"/>
+          <w:rtl w:val="0"/>
+        </w:rPr>
+        <w:t xml:space="preserve">UZ: Biz sizning g'oyalaringizni haqiqatga aylantiramiz</w:t>
+      </w:r>
+    </w:p>
+    <w:p>
+      <w:pPr>
+        <w:numPr>
+          <w:ilvl w:val="0"/>
+          <w:numId w:val="301"/>
+        </w:numPr>
+        <w:spacing w:after="0" w:before="0" w:lineRule="auto"/>
+        <w:ind w:left="720" w:hanging="360"/>
+        <w:rPr>
+          <w:rFonts w:ascii="Times New Roman" w:cs="Times New Roman" w:eastAsia="Times New Roman" w:hAnsi="Times New Roman"/>
+        </w:rPr>
+      </w:pPr>
+      <w:r>
+        <w:rPr>
+          <w:rFonts w:ascii="Times New Roman" w:cs="Times New Roman" w:eastAsia="Times New Roman" w:hAnsi="Times New Roman"/>
+          <w:rtl w:val="0"/>
+        </w:rPr>
+        <w:t xml:space="preserve">EN: We will turn your ideas into reality</w:t>
+      </w:r>
+    </w:p>
+    <w:p>
+      <w:pPr>
+        <w:keepNext/>
+        <w:spacing w:after="0" w:before="0" w:lineRule="auto"/>
+        <w:rPr>
+          <w:rFonts w:ascii="Times New Roman" w:cs="Times New Roman" w:eastAsia="Times New Roman" w:hAnsi="Times New Roman"/>
+          <w:b w:val="1"/>
+          <w:bCs w:val="1"/>
+        </w:rPr>
+      </w:pPr>
+      <w:r>
+        <w:rPr>
+          <w:rFonts w:ascii="Times New Roman" w:cs="Times New Roman" w:eastAsia="Times New Roman" w:hAnsi="Times New Roman"/>
+          <w:b w:val="1"/>
+          <w:bCs w:val="1"/>
+          <w:rtl w:val="0"/>
+        </w:rPr>
+        <w:t xml:space="preserve">Средний</w:t>
+      </w:r>
+    </w:p>
+    <w:p>
+      <w:pPr>
+        <w:numPr>
+          <w:ilvl w:val="0"/>
+          <w:numId w:val="302"/>
+        </w:numPr>
+        <w:spacing w:after="0" w:before="0" w:lineRule="auto"/>
+        <w:ind w:left="720" w:hanging="360"/>
+        <w:rPr>
+          <w:rFonts w:ascii="Times New Roman" w:cs="Times New Roman" w:eastAsia="Times New Roman" w:hAnsi="Times New Roman"/>
+        </w:rPr>
+      </w:pPr>
+      <w:r>
+        <w:rPr>
+          <w:rFonts w:ascii="Times New Roman" w:cs="Times New Roman" w:eastAsia="Times New Roman" w:hAnsi="Times New Roman"/>
+          <w:rtl w:val="0"/>
+        </w:rPr>
+        <w:t xml:space="preserve">РУС: Мы превращаем ваши идеи в реальность, создавая высококачественные решения для вашего производства с максимальной точностью и надежностью</w:t>
+      </w:r>
+    </w:p>
+    <w:p>
+      <w:pPr>
+        <w:numPr>
+          <w:ilvl w:val="0"/>
+          <w:numId w:val="302"/>
+        </w:numPr>
+        <w:spacing w:after="0" w:before="0" w:lineRule="auto"/>
+        <w:ind w:left="720" w:hanging="360"/>
+        <w:rPr>
+          <w:rFonts w:ascii="Times New Roman" w:cs="Times New Roman" w:eastAsia="Times New Roman" w:hAnsi="Times New Roman"/>
+        </w:rPr>
+      </w:pPr>
+      <w:r>
+        <w:rPr>
+          <w:rFonts w:ascii="Times New Roman" w:cs="Times New Roman" w:eastAsia="Times New Roman" w:hAnsi="Times New Roman"/>
+          <w:rtl w:val="0"/>
+        </w:rPr>
+        <w:t xml:space="preserve">UZ: Biz sizning g'oyalaringizni haqiqatga aylantiramiz, maksimal aniqlik va ishonchlilik bilan ishlab chiqarishingiz uchun yuqori sifatli yechimlarni yaratamiz.</w:t>
+      </w:r>
+    </w:p>
+    <w:p>
+      <w:pPr>
+        <w:numPr>
+          <w:ilvl w:val="0"/>
+          <w:numId w:val="302"/>
+        </w:numPr>
+        <w:spacing w:after="0" w:before="0" w:lineRule="auto"/>
+        <w:ind w:left="720" w:hanging="360"/>
+        <w:rPr>
+          <w:rFonts w:ascii="Times New Roman" w:cs="Times New Roman" w:eastAsia="Times New Roman" w:hAnsi="Times New Roman"/>
+        </w:rPr>
+      </w:pPr>
+      <w:r>
+        <w:rPr>
+          <w:rFonts w:ascii="Times New Roman" w:cs="Times New Roman" w:eastAsia="Times New Roman" w:hAnsi="Times New Roman"/>
+          <w:rtl w:val="0"/>
+        </w:rPr>
+        <w:t xml:space="preserve">EN: We turn your ideas into reality, creating high-quality solutions for your production with maximum precision and reliability.</w:t>
+      </w:r>
+    </w:p>
+    <w:p>
+      <w:pPr>
+        <w:keepNext/>
+        <w:spacing w:after="0" w:before="0" w:lineRule="auto"/>
+        <w:rPr>
+          <w:rFonts w:ascii="Times New Roman" w:cs="Times New Roman" w:eastAsia="Times New Roman" w:hAnsi="Times New Roman"/>
+          <w:b w:val="1"/>
+          <w:bCs w:val="1"/>
+        </w:rPr>
+      </w:pPr>
+      <w:r>
+        <w:rPr>
+          <w:rFonts w:ascii="Times New Roman" w:cs="Times New Roman" w:eastAsia="Times New Roman" w:hAnsi="Times New Roman"/>
+          <w:b w:val="1"/>
+          <w:bCs w:val="1"/>
+          <w:rtl w:val="0"/>
+        </w:rPr>
+        <w:t xml:space="preserve">Полный</w:t>
+      </w:r>
+    </w:p>
+    <w:p>
+      <w:pPr>
+        <w:numPr>
+          <w:ilvl w:val="0"/>
+          <w:numId w:val="303"/>
+        </w:numPr>
+        <w:spacing w:after="0" w:before="0" w:lineRule="auto"/>
+        <w:ind w:left="720" w:hanging="360"/>
+        <w:rPr>
+          <w:rFonts w:ascii="Times New Roman" w:cs="Times New Roman" w:eastAsia="Times New Roman" w:hAnsi="Times New Roman"/>
+        </w:rPr>
+      </w:pPr>
+      <w:r>
+        <w:rPr>
+          <w:rFonts w:ascii="Times New Roman" w:cs="Times New Roman" w:eastAsia="Times New Roman" w:hAnsi="Times New Roman"/>
+          <w:rtl w:val="0"/>
+        </w:rPr>
+        <w:t xml:space="preserve">РУС: Мы превращаем ваши идеи в реальность, разрабатывая и производя высокоточные компоненты и системы для различных отраслей — от электроники до машиностроения, обеспечивая надежность, качество и эффективность на каждом этапе</w:t>
+      </w:r>
+    </w:p>
+    <w:p>
+      <w:pPr>
+        <w:numPr>
+          <w:ilvl w:val="0"/>
+          <w:numId w:val="303"/>
+        </w:numPr>
+        <w:spacing w:after="0" w:before="0" w:lineRule="auto"/>
+        <w:ind w:left="720" w:hanging="360"/>
+        <w:rPr>
+          <w:rFonts w:ascii="Times New Roman" w:cs="Times New Roman" w:eastAsia="Times New Roman" w:hAnsi="Times New Roman"/>
+        </w:rPr>
+      </w:pPr>
+      <w:r>
+        <w:rPr>
+          <w:rFonts w:ascii="Times New Roman" w:cs="Times New Roman" w:eastAsia="Times New Roman" w:hAnsi="Times New Roman"/>
+          <w:rtl w:val="0"/>
+        </w:rPr>
+        <w:t xml:space="preserve">UZ: Biz har bir bosqichda ishonchlilik, sifat va samaradorlikni ta'minlab, turli sohalar - elektronikadan mashinasozlikgacha bo'lgan yuqori aniqlikdagi komponentlar va tizimlarni ishlab chiqish va ishlab chiqarish orqali sizning g'oyalaringizni haqiqatga aylantiramiz.</w:t>
+      </w:r>
+    </w:p>
+    <w:p>
+      <w:pPr>
+        <w:numPr>
+          <w:ilvl w:val="0"/>
+          <w:numId w:val="303"/>
+        </w:numPr>
+        <w:spacing w:after="0" w:before="0" w:lineRule="auto"/>
+        <w:ind w:left="720" w:hanging="360"/>
+        <w:rPr>
+          <w:rFonts w:ascii="Times New Roman" w:cs="Times New Roman" w:eastAsia="Times New Roman" w:hAnsi="Times New Roman"/>
+        </w:rPr>
+      </w:pPr>
+      <w:r>
+        <w:rPr>
+          <w:rFonts w:ascii="Times New Roman" w:cs="Times New Roman" w:eastAsia="Times New Roman" w:hAnsi="Times New Roman"/>
+          <w:rtl w:val="0"/>
+        </w:rPr>
+        <w:t xml:space="preserve">EN: We turn your ideas into reality by developing and manufacturing high-precision components and systems for various industries - from electronics to mechanical engineering, ensuring reliability, quality and efficiency at every stage.</w:t>
+      </w:r>
+    </w:p>
+    <w:p>
+      <w:pPr>
+        <w:pStyle w:val="Heading2"/>
+        <w:keepNext/>
+        <w:spacing w:after="240" w:before="240" w:lineRule="auto"/>
+        <w:jc w:val="center"/>
+        <w:rPr>
+          <w:rFonts w:ascii="Times New Roman" w:cs="Times New Roman" w:eastAsia="Times New Roman" w:hAnsi="Times New Roman"/>
+        </w:rPr>
+      </w:pPr>
+      <w:bookmarkStart w:colFirst="0" w:colLast="0" w:name="_dlkip1008" w:id="1008"/>
+      <w:bookmarkEnd w:id="1008"/>
+      <w:r>
+        <w:rPr>
+          <w:rFonts w:ascii="Times New Roman" w:cs="Times New Roman" w:eastAsia="Times New Roman" w:hAnsi="Times New Roman"/>
+          <w:rtl w:val="0"/>
+        </w:rPr>
         <w:t xml:space="preserve">Контакты</w:t>
       </w:r>
     </w:p>
@@ -868,7 +1025,7 @@
       <w:pPr>
         <w:numPr>
           <w:ilvl w:val="0"/>
-          <w:numId w:val="302"/>
+          <w:numId w:val="304"/>
         </w:numPr>
         <w:spacing w:after="0" w:before="240" w:lineRule="auto"/>
         <w:ind w:left="720" w:hanging="360"/>
@@ -890,14 +1047,14 @@
           <w:rFonts w:ascii="Times New Roman" w:cs="Times New Roman" w:eastAsia="Times New Roman" w:hAnsi="Times New Roman"/>
           <w:rtl w:val="0"/>
         </w:rPr>
-        <w:t xml:space="preserve"> г. Ташкент, [уточнить]</w:t>
-      </w:r>
-    </w:p>
-    <w:p>
-      <w:pPr>
-        <w:numPr>
-          <w:ilvl w:val="0"/>
-          <w:numId w:val="302"/>
+        <w:t xml:space="preserve"> Республика Узбекистан 1000231,г.Ташкент, Бектемирский район, Мажнутал МФЙ, ул. Рахат 13а</w:t>
+      </w:r>
+    </w:p>
+    <w:p>
+      <w:pPr>
+        <w:numPr>
+          <w:ilvl w:val="0"/>
+          <w:numId w:val="304"/>
         </w:numPr>
         <w:spacing w:after="0" w:before="0" w:lineRule="auto"/>
         <w:ind w:left="720" w:hanging="360"/>
@@ -926,7 +1083,7 @@
       <w:pPr>
         <w:numPr>
           <w:ilvl w:val="0"/>
-          <w:numId w:val="302"/>
+          <w:numId w:val="304"/>
         </w:numPr>
         <w:spacing w:after="0" w:before="0" w:lineRule="auto"/>
         <w:ind w:left="720" w:hanging="360"/>
@@ -955,9 +1112,9 @@
       <w:pPr>
         <w:numPr>
           <w:ilvl w:val="0"/>
-          <w:numId w:val="302"/>
-        </w:numPr>
-        <w:spacing w:after="0" w:before="0" w:lineRule="auto"/>
+          <w:numId w:val="304"/>
+        </w:numPr>
+        <w:spacing w:after="240" w:before="0" w:lineRule="auto"/>
         <w:ind w:left="720" w:hanging="360"/>
         <w:rPr>
           <w:rFonts w:ascii="Times New Roman" w:cs="Times New Roman" w:eastAsia="Times New Roman" w:hAnsi="Times New Roman"/>
@@ -971,35 +1128,6 @@
           <w:rtl w:val="0"/>
         </w:rPr>
         <w:t xml:space="preserve">Сайт:</w:t>
-      </w:r>
-      <w:r>
-        <w:rPr>
-          <w:rFonts w:ascii="Times New Roman" w:cs="Times New Roman" w:eastAsia="Times New Roman" w:hAnsi="Times New Roman"/>
-          <w:rtl w:val="0"/>
-        </w:rPr>
-        <w:t xml:space="preserve"> [уточнить]</w:t>
-      </w:r>
-    </w:p>
-    <w:p>
-      <w:pPr>
-        <w:numPr>
-          <w:ilvl w:val="0"/>
-          <w:numId w:val="302"/>
-        </w:numPr>
-        <w:spacing w:after="240" w:before="0" w:lineRule="auto"/>
-        <w:ind w:left="720" w:hanging="360"/>
-        <w:rPr>
-          <w:rFonts w:ascii="Times New Roman" w:cs="Times New Roman" w:eastAsia="Times New Roman" w:hAnsi="Times New Roman"/>
-        </w:rPr>
-      </w:pPr>
-      <w:r>
-        <w:rPr>
-          <w:rFonts w:ascii="Times New Roman" w:cs="Times New Roman" w:eastAsia="Times New Roman" w:hAnsi="Times New Roman"/>
-          <w:b w:val="1"/>
-          <w:bCs w:val="1"/>
-          <w:rtl w:val="0"/>
-        </w:rPr>
-        <w:t xml:space="preserve">Социальные сети:</w:t>
       </w:r>
       <w:r>
         <w:rPr>
@@ -19206,6 +19334,18 @@
     </w:lvlOverride>
   </w:num>
   <w:num w:numId="302">
+    <w:abstractNumId w:val="1"/>
+    <w:lvlOverride w:ilvl="0">
+      <w:startOverride w:val="1"/>
+    </w:lvlOverride>
+  </w:num>
+  <w:num w:numId="303">
+    <w:abstractNumId w:val="1"/>
+    <w:lvlOverride w:ilvl="0">
+      <w:startOverride w:val="1"/>
+    </w:lvlOverride>
+  </w:num>
+  <w:num w:numId="304">
     <w:abstractNumId w:val="1"/>
     <w:lvlOverride w:ilvl="0">
       <w:startOverride w:val="1"/>

</xml_diff>

<commit_message>
Variant 1 intro: Domalogica text adapted to DLKIP Uzbekistan, matches client's history
Co-Authored-By: Claude Opus 5.5 <noreply@anthropic.com>
Claude-Session: https://claude.ai/code/session_01V2FjruK1JeG3yk1AXHn97V
</commit_message>
<xml_diff>
--- a/dlkip_brandbook/out/40'0'0 БРЕНДБУК DLKIP (вариант 1 - как у Домалогики).docx
+++ b/dlkip_brandbook/out/40'0'0 БРЕНДБУК DLKIP (вариант 1 - как у Домалогики).docx
@@ -405,7 +405,7 @@
           <w:rFonts w:ascii="Times New Roman" w:cs="Times New Roman" w:eastAsia="Times New Roman" w:hAnsi="Times New Roman"/>
           <w:rtl w:val="0"/>
         </w:rPr>
-        <w:t xml:space="preserve">Компания DLKIP разрабатывает и производит электронные устройства с 2015 года. DLKIP была создана путём объединения двух компаний: ведущего узбекского поставщика промышленных датчиков с более чем 7-летним опытом работы и российской R&amp;D компании-разработчика электроники с многолетним опытом разработки и серийного производства.</w:t>
+        <w:t xml:space="preserve">Компания DLKIP Electronics разрабатывает и производит электронные устройства. Свою историю мы ведём с 2015 года — от материнской компании Domalogica. Мы обладаем опытом и знаниями в разработке электроники для различных областей — от автомобильной промышленности до промышленных систем и бытовой техники.</w:t>
       </w:r>
     </w:p>
     <w:p>
@@ -420,7 +420,7 @@
           <w:rFonts w:ascii="Times New Roman" w:cs="Times New Roman" w:eastAsia="Times New Roman" w:hAnsi="Times New Roman"/>
           <w:rtl w:val="0"/>
         </w:rPr>
-        <w:t xml:space="preserve">Наши клиенты — крупнейшие производственные предприятия Узбекистана, добывающие нефть, газ, золото, уран, медь. У нас развернуто современное производство с линией SMD монтажа и современным оборудованием. Мы производим более 200 моделей различных датчиков для промышленного сектора.</w:t>
+        <w:t xml:space="preserve">У нас развернуто современное производство в Узбекистане (г. Ташкент) с линией SMD монтажа и современным оборудованием. В команде работают первоклассные специалисты в различных областях. Наши клиенты — крупнейшие производственные предприятия Узбекистана, добывающие нефть, газ, золото, уран, медь. Мы производим более 200 моделей различных датчиков для промышленного сектора.</w:t>
       </w:r>
     </w:p>
     <w:p>
@@ -435,7 +435,7 @@
           <w:rFonts w:ascii="Times New Roman" w:cs="Times New Roman" w:eastAsia="Times New Roman" w:hAnsi="Times New Roman"/>
           <w:rtl w:val="0"/>
         </w:rPr>
-        <w:t xml:space="preserve">Мы можем создать любое устройство от идеи до серийного производства, обеспечивая внутренний рынок Узбекистана качественными, функциональными и современными датчиками с хорошим соотношением цена-качество.</w:t>
+        <w:t xml:space="preserve">Мы можем провести практически любое электронное устройство от стадии идеи до массового коммерческого производства.</w:t>
       </w:r>
     </w:p>
     <w:p>

</xml_diff>

<commit_message>
Variant 1: remove blank page after company section
Co-Authored-By: Claude Opus 5.5 <noreply@anthropic.com>
Claude-Session: https://claude.ai/code/session_01V2FjruK1JeG3yk1AXHn97V
</commit_message>
<xml_diff>
--- a/dlkip_brandbook/out/40'0'0 БРЕНДБУК DLKIP (вариант 1 - как у Домалогики).docx
+++ b/dlkip_brandbook/out/40'0'0 БРЕНДБУК DLKIP (вариант 1 - как у Домалогики).docx
@@ -1139,17 +1139,8 @@
     </w:p>
     <w:p>
       <w:pPr>
-        <w:rPr>
-          <w:rFonts w:ascii="Times New Roman" w:cs="Times New Roman" w:eastAsia="Times New Roman" w:hAnsi="Times New Roman"/>
-        </w:rPr>
-      </w:pPr>
-      <w:r>
-        <w:br w:type="page"/>
-      </w:r>
-    </w:p>
-    <w:p>
-      <w:pPr>
         <w:pStyle w:val="Heading1"/>
+        <w:pageBreakBefore/>
         <w:spacing w:after="240" w:before="240" w:lineRule="auto"/>
         <w:jc w:val="center"/>
         <w:rPr>

</xml_diff>

<commit_message>
Variant 1: DLKIP is a subsidiary of Domalogica only, Manokip moved to partners
Co-Authored-By: Claude Opus 5.5 <noreply@anthropic.com>
Claude-Session: https://claude.ai/code/session_01V2FjruK1JeG3yk1AXHn97V
</commit_message>
<xml_diff>
--- a/dlkip_brandbook/out/40'0'0 БРЕНДБУК DLKIP (вариант 1 - как у Домалогики).docx
+++ b/dlkip_brandbook/out/40'0'0 БРЕНДБУК DLKIP (вариант 1 - как у Домалогики).docx
@@ -618,7 +618,7 @@
           <w:rFonts w:ascii="Times New Roman" w:cs="Times New Roman" w:eastAsia="Times New Roman" w:hAnsi="Times New Roman"/>
           <w:rtl w:val="0"/>
         </w:rPr>
-        <w:t xml:space="preserve">Компания DLKIP Electronics была основана в 2023 году как дочерняя компания ведущих компаний DOMALOGICA и МАНОКИПА. Мы начали свою деятельность с целью разработки и производства высококачественных электронных устройств и компонентов для различных отраслей. Объединяя опыт и знания материнских компаний, мы быстро заняли свою нишу на рынке, ориентируясь на инновации и высокие стандарты качества. С самого начала нашей работы мы стремились создавать продукцию, соответствующую самым строгим требованиям, внедряя передовые технологии и автоматизируя процессы. Эти принципы позволили нам обеспечивать надежность и точность на каждом этапе производства. Сегодня DLKIP Electronics — это динамично развивающаяся компания с репутацией надежного партнера, предлагающая решения для различных отраслей, которая продолжает двигаться вперед, расширяя свои возможности и внедряя инновации для удовлетворения потребностей клиентов.</w:t>
+        <w:t xml:space="preserve">Компания DLKIP Electronics была основана в 2023 году как дочерняя компания DOMALOGICA. Мы начали свою деятельность с целью разработки и производства высококачественных электронных устройств и компонентов для различных отраслей. Объединяя опыт и знания материнской компании, мы быстро заняли свою нишу на рынке, ориентируясь на инновации и высокие стандарты качества. С самого начала нашей работы мы стремились создавать продукцию, соответствующую самым строгим требованиям, внедряя передовые технологии и автоматизируя процессы. Эти принципы позволили нам обеспечивать надежность и точность на каждом этапе производства. Сегодня DLKIP Electronics — это динамично развивающаяся компания с репутацией надежного партнера, предлагающая решения для различных отраслей, которая продолжает двигаться вперед, расширяя свои возможности и внедряя инновации для удовлетворения потребностей клиентов.</w:t>
       </w:r>
     </w:p>
     <w:p>
@@ -638,7 +638,7 @@
           <w:rFonts w:ascii="Times New Roman" w:cs="Times New Roman" w:eastAsia="Times New Roman" w:hAnsi="Times New Roman"/>
           <w:rtl w:val="0"/>
         </w:rPr>
-        <w:t xml:space="preserve">Учредители</w:t>
+        <w:t xml:space="preserve">Материнская компания</w:t>
       </w:r>
     </w:p>
     <w:p>
@@ -654,21 +654,6 @@
           <w:rtl w:val="0"/>
         </w:rPr>
         <w:t xml:space="preserve">Компания Domalogica — российский разработчик и производитель электроники из Дагестана, работающий с 2015 года. Мы обладаем опытом в разработке электронных устройств в различных областях. Наше современное производство расположено в России при этом российское производство находится на территории Дагестанского технического университета. В нашей команде работают высококвалифицированные специалисты, и компанией управляет генеральный директор Юсупанов Хасай. Мы проводим полный цикл разработки — от идеи до массового коммерческого производства.</w:t>
-      </w:r>
-    </w:p>
-    <w:p>
-      <w:pPr>
-        <w:spacing w:after="240" w:before="240" w:lineRule="auto"/>
-        <w:rPr>
-          <w:rFonts w:ascii="Times New Roman" w:cs="Times New Roman" w:eastAsia="Times New Roman" w:hAnsi="Times New Roman"/>
-        </w:rPr>
-      </w:pPr>
-      <w:r>
-        <w:rPr>
-          <w:rFonts w:ascii="Times New Roman" w:cs="Times New Roman" w:eastAsia="Times New Roman" w:hAnsi="Times New Roman"/>
-          <w:rtl w:val="0"/>
-        </w:rPr>
-        <w:t xml:space="preserve">Компания Manokip — крупнейший производитель манометров в Узбекистане, работающая с 2015 года.</w:t>
       </w:r>
     </w:p>
     <w:p>
@@ -688,7 +673,7 @@
           <w:rFonts w:ascii="Times New Roman" w:cs="Times New Roman" w:eastAsia="Times New Roman" w:hAnsi="Times New Roman"/>
           <w:rtl w:val="0"/>
         </w:rPr>
-        <w:t xml:space="preserve">Миссия компании</w:t>
+        <w:t xml:space="preserve">Партнёры</w:t>
       </w:r>
     </w:p>
     <w:p>
@@ -703,7 +688,7 @@
           <w:rFonts w:ascii="Times New Roman" w:cs="Times New Roman" w:eastAsia="Times New Roman" w:hAnsi="Times New Roman"/>
           <w:rtl w:val="0"/>
         </w:rPr>
-        <w:t xml:space="preserve">Миссия компании DLKIP Electronics — разрабатывать и производить высококачественные и инновационные электронные устройства, которые не только соответствуют современным стандартам, но и значительно улучшают жизнь людей. Мы ставим перед собой задачу создавать продукцию, которая отвечает самым строгим требованиям надежности, безопасности и функциональности, обеспечивая нашим клиентам конкурентные преимущества на рынке. Мы стремимся к постоянному совершенствованию технологий и производственных процессов, внедряя передовые разработки и автоматизацию на каждом этапе работы. Наши инженеры и специалисты постоянно ищут новые подходы и решения, чтобы создавать устройства, которые решают реальные задачи и повышают эффективность различных отраслей. Мы гордимся своим вкладом в развитие электроники и всегда нацелены на создание долгосрочных, взаимовыгодных партнерских отношений с клиентами, поставщиками и сотрудниками.</w:t>
+        <w:t xml:space="preserve">Компания Manokip — крупнейший производитель манометров в Узбекистане, работающая с 2015 года.</w:t>
       </w:r>
     </w:p>
     <w:p>
@@ -723,7 +708,7 @@
           <w:rFonts w:ascii="Times New Roman" w:cs="Times New Roman" w:eastAsia="Times New Roman" w:hAnsi="Times New Roman"/>
           <w:rtl w:val="0"/>
         </w:rPr>
-        <w:t xml:space="preserve">Цель компании</w:t>
+        <w:t xml:space="preserve">Миссия компании</w:t>
       </w:r>
     </w:p>
     <w:p>
@@ -738,7 +723,7 @@
           <w:rFonts w:ascii="Times New Roman" w:cs="Times New Roman" w:eastAsia="Times New Roman" w:hAnsi="Times New Roman"/>
           <w:rtl w:val="0"/>
         </w:rPr>
-        <w:t xml:space="preserve">Цель компании DLKIP Electronics — помочь нашим клиентам воплотить их идеи в реальность, предоставляя высококачественные и инновационные электронные решения, которые соответствуют самым высоким стандартам и требованиям отрасли. Мы стремимся быть не просто поставщиком, а надежным партнером, который активно участвует в процессе создания и реализации идей, обеспечивая полный цикл разработки и производства электронных устройств. Мы ставим перед собой задачу разрабатывать продукцию, которая помогает нашим клиентам достигать их целей, повышать конкурентоспособность и оптимизировать производственные процессы. Используя передовые технологии, современные методы автоматизации и глубокие знания в области электроники, мы создаем решения, которые помогают бизнесу расти и развиваться. Мы ориентированы на долгосрочные партнерские отношения, предоставляя нашим клиентам не только качественные продукты, но и высококлассную техническую поддержку, консультации и индивидуальный подход. Наша цель — это не просто создание устройств, а создание технологий, которые решают реальные проблемы и открывают новые возможности для наших клиентов.</w:t>
+        <w:t xml:space="preserve">Миссия компании DLKIP Electronics — разрабатывать и производить высококачественные и инновационные электронные устройства, которые не только соответствуют современным стандартам, но и значительно улучшают жизнь людей. Мы ставим перед собой задачу создавать продукцию, которая отвечает самым строгим требованиям надежности, безопасности и функциональности, обеспечивая нашим клиентам конкурентные преимущества на рынке. Мы стремимся к постоянному совершенствованию технологий и производственных процессов, внедряя передовые разработки и автоматизацию на каждом этапе работы. Наши инженеры и специалисты постоянно ищут новые подходы и решения, чтобы создавать устройства, которые решают реальные задачи и повышают эффективность различных отраслей. Мы гордимся своим вкладом в развитие электроники и всегда нацелены на создание долгосрочных, взаимовыгодных партнерских отношений с клиентами, поставщиками и сотрудниками.</w:t>
       </w:r>
     </w:p>
     <w:p>
@@ -758,247 +743,22 @@
           <w:rFonts w:ascii="Times New Roman" w:cs="Times New Roman" w:eastAsia="Times New Roman" w:hAnsi="Times New Roman"/>
           <w:rtl w:val="0"/>
         </w:rPr>
-        <w:t xml:space="preserve">Слоган компании</w:t>
-      </w:r>
-    </w:p>
-    <w:p>
-      <w:pPr>
-        <w:keepNext/>
-        <w:spacing w:after="0" w:before="0" w:lineRule="auto"/>
-        <w:rPr>
-          <w:rFonts w:ascii="Times New Roman" w:cs="Times New Roman" w:eastAsia="Times New Roman" w:hAnsi="Times New Roman"/>
-          <w:b w:val="1"/>
-          <w:bCs w:val="1"/>
-        </w:rPr>
-      </w:pPr>
-      <w:r>
-        <w:rPr>
-          <w:rFonts w:ascii="Times New Roman" w:cs="Times New Roman" w:eastAsia="Times New Roman" w:hAnsi="Times New Roman"/>
-          <w:b w:val="1"/>
-          <w:bCs w:val="1"/>
-          <w:rtl w:val="0"/>
-        </w:rPr>
-        <w:t xml:space="preserve">Короткий</w:t>
-      </w:r>
-    </w:p>
-    <w:p>
-      <w:pPr>
-        <w:numPr>
-          <w:ilvl w:val="0"/>
-          <w:numId w:val="301"/>
-        </w:numPr>
-        <w:spacing w:after="0" w:before="0" w:lineRule="auto"/>
-        <w:ind w:left="720" w:hanging="360"/>
-        <w:rPr>
-          <w:rFonts w:ascii="Times New Roman" w:cs="Times New Roman" w:eastAsia="Times New Roman" w:hAnsi="Times New Roman"/>
-        </w:rPr>
-      </w:pPr>
-      <w:r>
-        <w:rPr>
-          <w:rFonts w:ascii="Times New Roman" w:cs="Times New Roman" w:eastAsia="Times New Roman" w:hAnsi="Times New Roman"/>
-          <w:rtl w:val="0"/>
-        </w:rPr>
-        <w:t xml:space="preserve">РУС: Мы превратим ваши идеи в реальность</w:t>
-      </w:r>
-    </w:p>
-    <w:p>
-      <w:pPr>
-        <w:numPr>
-          <w:ilvl w:val="0"/>
-          <w:numId w:val="301"/>
-        </w:numPr>
-        <w:spacing w:after="0" w:before="0" w:lineRule="auto"/>
-        <w:ind w:left="720" w:hanging="360"/>
-        <w:rPr>
-          <w:rFonts w:ascii="Times New Roman" w:cs="Times New Roman" w:eastAsia="Times New Roman" w:hAnsi="Times New Roman"/>
-        </w:rPr>
-      </w:pPr>
-      <w:r>
-        <w:rPr>
-          <w:rFonts w:ascii="Times New Roman" w:cs="Times New Roman" w:eastAsia="Times New Roman" w:hAnsi="Times New Roman"/>
-          <w:rtl w:val="0"/>
-        </w:rPr>
-        <w:t xml:space="preserve">UZ: Biz sizning g'oyalaringizni haqiqatga aylantiramiz</w:t>
-      </w:r>
-    </w:p>
-    <w:p>
-      <w:pPr>
-        <w:numPr>
-          <w:ilvl w:val="0"/>
-          <w:numId w:val="301"/>
-        </w:numPr>
-        <w:spacing w:after="0" w:before="0" w:lineRule="auto"/>
-        <w:ind w:left="720" w:hanging="360"/>
-        <w:rPr>
-          <w:rFonts w:ascii="Times New Roman" w:cs="Times New Roman" w:eastAsia="Times New Roman" w:hAnsi="Times New Roman"/>
-        </w:rPr>
-      </w:pPr>
-      <w:r>
-        <w:rPr>
-          <w:rFonts w:ascii="Times New Roman" w:cs="Times New Roman" w:eastAsia="Times New Roman" w:hAnsi="Times New Roman"/>
-          <w:rtl w:val="0"/>
-        </w:rPr>
-        <w:t xml:space="preserve">EN: We will turn your ideas into reality</w:t>
-      </w:r>
-    </w:p>
-    <w:p>
-      <w:pPr>
-        <w:keepNext/>
-        <w:spacing w:after="0" w:before="0" w:lineRule="auto"/>
-        <w:rPr>
-          <w:rFonts w:ascii="Times New Roman" w:cs="Times New Roman" w:eastAsia="Times New Roman" w:hAnsi="Times New Roman"/>
-          <w:b w:val="1"/>
-          <w:bCs w:val="1"/>
-        </w:rPr>
-      </w:pPr>
-      <w:r>
-        <w:rPr>
-          <w:rFonts w:ascii="Times New Roman" w:cs="Times New Roman" w:eastAsia="Times New Roman" w:hAnsi="Times New Roman"/>
-          <w:b w:val="1"/>
-          <w:bCs w:val="1"/>
-          <w:rtl w:val="0"/>
-        </w:rPr>
-        <w:t xml:space="preserve">Средний</w:t>
-      </w:r>
-    </w:p>
-    <w:p>
-      <w:pPr>
-        <w:numPr>
-          <w:ilvl w:val="0"/>
-          <w:numId w:val="302"/>
-        </w:numPr>
-        <w:spacing w:after="0" w:before="0" w:lineRule="auto"/>
-        <w:ind w:left="720" w:hanging="360"/>
-        <w:rPr>
-          <w:rFonts w:ascii="Times New Roman" w:cs="Times New Roman" w:eastAsia="Times New Roman" w:hAnsi="Times New Roman"/>
-        </w:rPr>
-      </w:pPr>
-      <w:r>
-        <w:rPr>
-          <w:rFonts w:ascii="Times New Roman" w:cs="Times New Roman" w:eastAsia="Times New Roman" w:hAnsi="Times New Roman"/>
-          <w:rtl w:val="0"/>
-        </w:rPr>
-        <w:t xml:space="preserve">РУС: Мы превращаем ваши идеи в реальность, создавая высококачественные решения для вашего производства с максимальной точностью и надежностью</w:t>
-      </w:r>
-    </w:p>
-    <w:p>
-      <w:pPr>
-        <w:numPr>
-          <w:ilvl w:val="0"/>
-          <w:numId w:val="302"/>
-        </w:numPr>
-        <w:spacing w:after="0" w:before="0" w:lineRule="auto"/>
-        <w:ind w:left="720" w:hanging="360"/>
-        <w:rPr>
-          <w:rFonts w:ascii="Times New Roman" w:cs="Times New Roman" w:eastAsia="Times New Roman" w:hAnsi="Times New Roman"/>
-        </w:rPr>
-      </w:pPr>
-      <w:r>
-        <w:rPr>
-          <w:rFonts w:ascii="Times New Roman" w:cs="Times New Roman" w:eastAsia="Times New Roman" w:hAnsi="Times New Roman"/>
-          <w:rtl w:val="0"/>
-        </w:rPr>
-        <w:t xml:space="preserve">UZ: Biz sizning g'oyalaringizni haqiqatga aylantiramiz, maksimal aniqlik va ishonchlilik bilan ishlab chiqarishingiz uchun yuqori sifatli yechimlarni yaratamiz.</w:t>
-      </w:r>
-    </w:p>
-    <w:p>
-      <w:pPr>
-        <w:numPr>
-          <w:ilvl w:val="0"/>
-          <w:numId w:val="302"/>
-        </w:numPr>
-        <w:spacing w:after="0" w:before="0" w:lineRule="auto"/>
-        <w:ind w:left="720" w:hanging="360"/>
-        <w:rPr>
-          <w:rFonts w:ascii="Times New Roman" w:cs="Times New Roman" w:eastAsia="Times New Roman" w:hAnsi="Times New Roman"/>
-        </w:rPr>
-      </w:pPr>
-      <w:r>
-        <w:rPr>
-          <w:rFonts w:ascii="Times New Roman" w:cs="Times New Roman" w:eastAsia="Times New Roman" w:hAnsi="Times New Roman"/>
-          <w:rtl w:val="0"/>
-        </w:rPr>
-        <w:t xml:space="preserve">EN: We turn your ideas into reality, creating high-quality solutions for your production with maximum precision and reliability.</w:t>
-      </w:r>
-    </w:p>
-    <w:p>
-      <w:pPr>
-        <w:keepNext/>
-        <w:spacing w:after="0" w:before="0" w:lineRule="auto"/>
-        <w:rPr>
-          <w:rFonts w:ascii="Times New Roman" w:cs="Times New Roman" w:eastAsia="Times New Roman" w:hAnsi="Times New Roman"/>
-          <w:b w:val="1"/>
-          <w:bCs w:val="1"/>
-        </w:rPr>
-      </w:pPr>
-      <w:r>
-        <w:rPr>
-          <w:rFonts w:ascii="Times New Roman" w:cs="Times New Roman" w:eastAsia="Times New Roman" w:hAnsi="Times New Roman"/>
-          <w:b w:val="1"/>
-          <w:bCs w:val="1"/>
-          <w:rtl w:val="0"/>
-        </w:rPr>
-        <w:t xml:space="preserve">Полный</w:t>
-      </w:r>
-    </w:p>
-    <w:p>
-      <w:pPr>
-        <w:numPr>
-          <w:ilvl w:val="0"/>
-          <w:numId w:val="303"/>
-        </w:numPr>
-        <w:spacing w:after="0" w:before="0" w:lineRule="auto"/>
-        <w:ind w:left="720" w:hanging="360"/>
-        <w:rPr>
-          <w:rFonts w:ascii="Times New Roman" w:cs="Times New Roman" w:eastAsia="Times New Roman" w:hAnsi="Times New Roman"/>
-        </w:rPr>
-      </w:pPr>
-      <w:r>
-        <w:rPr>
-          <w:rFonts w:ascii="Times New Roman" w:cs="Times New Roman" w:eastAsia="Times New Roman" w:hAnsi="Times New Roman"/>
-          <w:rtl w:val="0"/>
-        </w:rPr>
-        <w:t xml:space="preserve">РУС: Мы превращаем ваши идеи в реальность, разрабатывая и производя высокоточные компоненты и системы для различных отраслей — от электроники до машиностроения, обеспечивая надежность, качество и эффективность на каждом этапе</w:t>
-      </w:r>
-    </w:p>
-    <w:p>
-      <w:pPr>
-        <w:numPr>
-          <w:ilvl w:val="0"/>
-          <w:numId w:val="303"/>
-        </w:numPr>
-        <w:spacing w:after="0" w:before="0" w:lineRule="auto"/>
-        <w:ind w:left="720" w:hanging="360"/>
-        <w:rPr>
-          <w:rFonts w:ascii="Times New Roman" w:cs="Times New Roman" w:eastAsia="Times New Roman" w:hAnsi="Times New Roman"/>
-        </w:rPr>
-      </w:pPr>
-      <w:r>
-        <w:rPr>
-          <w:rFonts w:ascii="Times New Roman" w:cs="Times New Roman" w:eastAsia="Times New Roman" w:hAnsi="Times New Roman"/>
-          <w:rtl w:val="0"/>
-        </w:rPr>
-        <w:t xml:space="preserve">UZ: Biz har bir bosqichda ishonchlilik, sifat va samaradorlikni ta'minlab, turli sohalar - elektronikadan mashinasozlikgacha bo'lgan yuqori aniqlikdagi komponentlar va tizimlarni ishlab chiqish va ishlab chiqarish orqali sizning g'oyalaringizni haqiqatga aylantiramiz.</w:t>
-      </w:r>
-    </w:p>
-    <w:p>
-      <w:pPr>
-        <w:numPr>
-          <w:ilvl w:val="0"/>
-          <w:numId w:val="303"/>
-        </w:numPr>
-        <w:spacing w:after="0" w:before="0" w:lineRule="auto"/>
-        <w:ind w:left="720" w:hanging="360"/>
-        <w:rPr>
-          <w:rFonts w:ascii="Times New Roman" w:cs="Times New Roman" w:eastAsia="Times New Roman" w:hAnsi="Times New Roman"/>
-        </w:rPr>
-      </w:pPr>
-      <w:r>
-        <w:rPr>
-          <w:rFonts w:ascii="Times New Roman" w:cs="Times New Roman" w:eastAsia="Times New Roman" w:hAnsi="Times New Roman"/>
-          <w:rtl w:val="0"/>
-        </w:rPr>
-        <w:t xml:space="preserve">EN: We turn your ideas into reality by developing and manufacturing high-precision components and systems for various industries - from electronics to mechanical engineering, ensuring reliability, quality and efficiency at every stage.</w:t>
+        <w:t xml:space="preserve">Цель компании</w:t>
+      </w:r>
+    </w:p>
+    <w:p>
+      <w:pPr>
+        <w:spacing w:after="240" w:before="240" w:lineRule="auto"/>
+        <w:rPr>
+          <w:rFonts w:ascii="Times New Roman" w:cs="Times New Roman" w:eastAsia="Times New Roman" w:hAnsi="Times New Roman"/>
+        </w:rPr>
+      </w:pPr>
+      <w:r>
+        <w:rPr>
+          <w:rFonts w:ascii="Times New Roman" w:cs="Times New Roman" w:eastAsia="Times New Roman" w:hAnsi="Times New Roman"/>
+          <w:rtl w:val="0"/>
+        </w:rPr>
+        <w:t xml:space="preserve">Цель компании DLKIP Electronics — помочь нашим клиентам воплотить их идеи в реальность, предоставляя высококачественные и инновационные электронные решения, которые соответствуют самым высоким стандартам и требованиям отрасли. Мы стремимся быть не просто поставщиком, а надежным партнером, который активно участвует в процессе создания и реализации идей, обеспечивая полный цикл разработки и производства электронных устройств. Мы ставим перед собой задачу разрабатывать продукцию, которая помогает нашим клиентам достигать их целей, повышать конкурентоспособность и оптимизировать производственные процессы. Используя передовые технологии, современные методы автоматизации и глубокие знания в области электроники, мы создаем решения, которые помогают бизнесу расти и развиваться. Мы ориентированы на долгосрочные партнерские отношения, предоставляя нашим клиентам не только качественные продукты, но и высококлассную техническую поддержку, консультации и индивидуальный подход. Наша цель — это не просто создание устройств, а создание технологий, которые решают реальные проблемы и открывают новые возможности для наших клиентов.</w:t>
       </w:r>
     </w:p>
     <w:p>
@@ -1013,6 +773,266 @@
       </w:pPr>
       <w:bookmarkStart w:colFirst="0" w:colLast="0" w:name="_dlkip1008" w:id="1008"/>
       <w:bookmarkEnd w:id="1008"/>
+      <w:r>
+        <w:rPr>
+          <w:rFonts w:ascii="Times New Roman" w:cs="Times New Roman" w:eastAsia="Times New Roman" w:hAnsi="Times New Roman"/>
+          <w:rtl w:val="0"/>
+        </w:rPr>
+        <w:t xml:space="preserve">Слоган компании</w:t>
+      </w:r>
+    </w:p>
+    <w:p>
+      <w:pPr>
+        <w:keepNext/>
+        <w:spacing w:after="0" w:before="0" w:lineRule="auto"/>
+        <w:rPr>
+          <w:rFonts w:ascii="Times New Roman" w:cs="Times New Roman" w:eastAsia="Times New Roman" w:hAnsi="Times New Roman"/>
+          <w:b w:val="1"/>
+          <w:bCs w:val="1"/>
+        </w:rPr>
+      </w:pPr>
+      <w:r>
+        <w:rPr>
+          <w:rFonts w:ascii="Times New Roman" w:cs="Times New Roman" w:eastAsia="Times New Roman" w:hAnsi="Times New Roman"/>
+          <w:b w:val="1"/>
+          <w:bCs w:val="1"/>
+          <w:rtl w:val="0"/>
+        </w:rPr>
+        <w:t xml:space="preserve">Короткий</w:t>
+      </w:r>
+    </w:p>
+    <w:p>
+      <w:pPr>
+        <w:numPr>
+          <w:ilvl w:val="0"/>
+          <w:numId w:val="301"/>
+        </w:numPr>
+        <w:spacing w:after="0" w:before="0" w:lineRule="auto"/>
+        <w:ind w:left="720" w:hanging="360"/>
+        <w:rPr>
+          <w:rFonts w:ascii="Times New Roman" w:cs="Times New Roman" w:eastAsia="Times New Roman" w:hAnsi="Times New Roman"/>
+        </w:rPr>
+      </w:pPr>
+      <w:r>
+        <w:rPr>
+          <w:rFonts w:ascii="Times New Roman" w:cs="Times New Roman" w:eastAsia="Times New Roman" w:hAnsi="Times New Roman"/>
+          <w:rtl w:val="0"/>
+        </w:rPr>
+        <w:t xml:space="preserve">РУС: Мы превратим ваши идеи в реальность</w:t>
+      </w:r>
+    </w:p>
+    <w:p>
+      <w:pPr>
+        <w:numPr>
+          <w:ilvl w:val="0"/>
+          <w:numId w:val="301"/>
+        </w:numPr>
+        <w:spacing w:after="0" w:before="0" w:lineRule="auto"/>
+        <w:ind w:left="720" w:hanging="360"/>
+        <w:rPr>
+          <w:rFonts w:ascii="Times New Roman" w:cs="Times New Roman" w:eastAsia="Times New Roman" w:hAnsi="Times New Roman"/>
+        </w:rPr>
+      </w:pPr>
+      <w:r>
+        <w:rPr>
+          <w:rFonts w:ascii="Times New Roman" w:cs="Times New Roman" w:eastAsia="Times New Roman" w:hAnsi="Times New Roman"/>
+          <w:rtl w:val="0"/>
+        </w:rPr>
+        <w:t xml:space="preserve">UZ: Biz sizning g'oyalaringizni haqiqatga aylantiramiz</w:t>
+      </w:r>
+    </w:p>
+    <w:p>
+      <w:pPr>
+        <w:numPr>
+          <w:ilvl w:val="0"/>
+          <w:numId w:val="301"/>
+        </w:numPr>
+        <w:spacing w:after="0" w:before="0" w:lineRule="auto"/>
+        <w:ind w:left="720" w:hanging="360"/>
+        <w:rPr>
+          <w:rFonts w:ascii="Times New Roman" w:cs="Times New Roman" w:eastAsia="Times New Roman" w:hAnsi="Times New Roman"/>
+        </w:rPr>
+      </w:pPr>
+      <w:r>
+        <w:rPr>
+          <w:rFonts w:ascii="Times New Roman" w:cs="Times New Roman" w:eastAsia="Times New Roman" w:hAnsi="Times New Roman"/>
+          <w:rtl w:val="0"/>
+        </w:rPr>
+        <w:t xml:space="preserve">EN: We will turn your ideas into reality</w:t>
+      </w:r>
+    </w:p>
+    <w:p>
+      <w:pPr>
+        <w:keepNext/>
+        <w:spacing w:after="0" w:before="0" w:lineRule="auto"/>
+        <w:rPr>
+          <w:rFonts w:ascii="Times New Roman" w:cs="Times New Roman" w:eastAsia="Times New Roman" w:hAnsi="Times New Roman"/>
+          <w:b w:val="1"/>
+          <w:bCs w:val="1"/>
+        </w:rPr>
+      </w:pPr>
+      <w:r>
+        <w:rPr>
+          <w:rFonts w:ascii="Times New Roman" w:cs="Times New Roman" w:eastAsia="Times New Roman" w:hAnsi="Times New Roman"/>
+          <w:b w:val="1"/>
+          <w:bCs w:val="1"/>
+          <w:rtl w:val="0"/>
+        </w:rPr>
+        <w:t xml:space="preserve">Средний</w:t>
+      </w:r>
+    </w:p>
+    <w:p>
+      <w:pPr>
+        <w:numPr>
+          <w:ilvl w:val="0"/>
+          <w:numId w:val="302"/>
+        </w:numPr>
+        <w:spacing w:after="0" w:before="0" w:lineRule="auto"/>
+        <w:ind w:left="720" w:hanging="360"/>
+        <w:rPr>
+          <w:rFonts w:ascii="Times New Roman" w:cs="Times New Roman" w:eastAsia="Times New Roman" w:hAnsi="Times New Roman"/>
+        </w:rPr>
+      </w:pPr>
+      <w:r>
+        <w:rPr>
+          <w:rFonts w:ascii="Times New Roman" w:cs="Times New Roman" w:eastAsia="Times New Roman" w:hAnsi="Times New Roman"/>
+          <w:rtl w:val="0"/>
+        </w:rPr>
+        <w:t xml:space="preserve">РУС: Мы превращаем ваши идеи в реальность, создавая высококачественные решения для вашего производства с максимальной точностью и надежностью</w:t>
+      </w:r>
+    </w:p>
+    <w:p>
+      <w:pPr>
+        <w:numPr>
+          <w:ilvl w:val="0"/>
+          <w:numId w:val="302"/>
+        </w:numPr>
+        <w:spacing w:after="0" w:before="0" w:lineRule="auto"/>
+        <w:ind w:left="720" w:hanging="360"/>
+        <w:rPr>
+          <w:rFonts w:ascii="Times New Roman" w:cs="Times New Roman" w:eastAsia="Times New Roman" w:hAnsi="Times New Roman"/>
+        </w:rPr>
+      </w:pPr>
+      <w:r>
+        <w:rPr>
+          <w:rFonts w:ascii="Times New Roman" w:cs="Times New Roman" w:eastAsia="Times New Roman" w:hAnsi="Times New Roman"/>
+          <w:rtl w:val="0"/>
+        </w:rPr>
+        <w:t xml:space="preserve">UZ: Biz sizning g'oyalaringizni haqiqatga aylantiramiz, maksimal aniqlik va ishonchlilik bilan ishlab chiqarishingiz uchun yuqori sifatli yechimlarni yaratamiz.</w:t>
+      </w:r>
+    </w:p>
+    <w:p>
+      <w:pPr>
+        <w:numPr>
+          <w:ilvl w:val="0"/>
+          <w:numId w:val="302"/>
+        </w:numPr>
+        <w:spacing w:after="0" w:before="0" w:lineRule="auto"/>
+        <w:ind w:left="720" w:hanging="360"/>
+        <w:rPr>
+          <w:rFonts w:ascii="Times New Roman" w:cs="Times New Roman" w:eastAsia="Times New Roman" w:hAnsi="Times New Roman"/>
+        </w:rPr>
+      </w:pPr>
+      <w:r>
+        <w:rPr>
+          <w:rFonts w:ascii="Times New Roman" w:cs="Times New Roman" w:eastAsia="Times New Roman" w:hAnsi="Times New Roman"/>
+          <w:rtl w:val="0"/>
+        </w:rPr>
+        <w:t xml:space="preserve">EN: We turn your ideas into reality, creating high-quality solutions for your production with maximum precision and reliability.</w:t>
+      </w:r>
+    </w:p>
+    <w:p>
+      <w:pPr>
+        <w:keepNext/>
+        <w:spacing w:after="0" w:before="0" w:lineRule="auto"/>
+        <w:rPr>
+          <w:rFonts w:ascii="Times New Roman" w:cs="Times New Roman" w:eastAsia="Times New Roman" w:hAnsi="Times New Roman"/>
+          <w:b w:val="1"/>
+          <w:bCs w:val="1"/>
+        </w:rPr>
+      </w:pPr>
+      <w:r>
+        <w:rPr>
+          <w:rFonts w:ascii="Times New Roman" w:cs="Times New Roman" w:eastAsia="Times New Roman" w:hAnsi="Times New Roman"/>
+          <w:b w:val="1"/>
+          <w:bCs w:val="1"/>
+          <w:rtl w:val="0"/>
+        </w:rPr>
+        <w:t xml:space="preserve">Полный</w:t>
+      </w:r>
+    </w:p>
+    <w:p>
+      <w:pPr>
+        <w:numPr>
+          <w:ilvl w:val="0"/>
+          <w:numId w:val="303"/>
+        </w:numPr>
+        <w:spacing w:after="0" w:before="0" w:lineRule="auto"/>
+        <w:ind w:left="720" w:hanging="360"/>
+        <w:rPr>
+          <w:rFonts w:ascii="Times New Roman" w:cs="Times New Roman" w:eastAsia="Times New Roman" w:hAnsi="Times New Roman"/>
+        </w:rPr>
+      </w:pPr>
+      <w:r>
+        <w:rPr>
+          <w:rFonts w:ascii="Times New Roman" w:cs="Times New Roman" w:eastAsia="Times New Roman" w:hAnsi="Times New Roman"/>
+          <w:rtl w:val="0"/>
+        </w:rPr>
+        <w:t xml:space="preserve">РУС: Мы превращаем ваши идеи в реальность, разрабатывая и производя высокоточные компоненты и системы для различных отраслей — от электроники до машиностроения, обеспечивая надежность, качество и эффективность на каждом этапе</w:t>
+      </w:r>
+    </w:p>
+    <w:p>
+      <w:pPr>
+        <w:numPr>
+          <w:ilvl w:val="0"/>
+          <w:numId w:val="303"/>
+        </w:numPr>
+        <w:spacing w:after="0" w:before="0" w:lineRule="auto"/>
+        <w:ind w:left="720" w:hanging="360"/>
+        <w:rPr>
+          <w:rFonts w:ascii="Times New Roman" w:cs="Times New Roman" w:eastAsia="Times New Roman" w:hAnsi="Times New Roman"/>
+        </w:rPr>
+      </w:pPr>
+      <w:r>
+        <w:rPr>
+          <w:rFonts w:ascii="Times New Roman" w:cs="Times New Roman" w:eastAsia="Times New Roman" w:hAnsi="Times New Roman"/>
+          <w:rtl w:val="0"/>
+        </w:rPr>
+        <w:t xml:space="preserve">UZ: Biz har bir bosqichda ishonchlilik, sifat va samaradorlikni ta'minlab, turli sohalar - elektronikadan mashinasozlikgacha bo'lgan yuqori aniqlikdagi komponentlar va tizimlarni ishlab chiqish va ishlab chiqarish orqali sizning g'oyalaringizni haqiqatga aylantiramiz.</w:t>
+      </w:r>
+    </w:p>
+    <w:p>
+      <w:pPr>
+        <w:numPr>
+          <w:ilvl w:val="0"/>
+          <w:numId w:val="303"/>
+        </w:numPr>
+        <w:spacing w:after="0" w:before="0" w:lineRule="auto"/>
+        <w:ind w:left="720" w:hanging="360"/>
+        <w:rPr>
+          <w:rFonts w:ascii="Times New Roman" w:cs="Times New Roman" w:eastAsia="Times New Roman" w:hAnsi="Times New Roman"/>
+        </w:rPr>
+      </w:pPr>
+      <w:r>
+        <w:rPr>
+          <w:rFonts w:ascii="Times New Roman" w:cs="Times New Roman" w:eastAsia="Times New Roman" w:hAnsi="Times New Roman"/>
+          <w:rtl w:val="0"/>
+        </w:rPr>
+        <w:t xml:space="preserve">EN: We turn your ideas into reality by developing and manufacturing high-precision components and systems for various industries - from electronics to mechanical engineering, ensuring reliability, quality and efficiency at every stage.</w:t>
+      </w:r>
+    </w:p>
+    <w:p>
+      <w:pPr>
+        <w:pStyle w:val="Heading2"/>
+        <w:keepNext/>
+        <w:spacing w:after="240" w:before="240" w:lineRule="auto"/>
+        <w:jc w:val="center"/>
+        <w:rPr>
+          <w:rFonts w:ascii="Times New Roman" w:cs="Times New Roman" w:eastAsia="Times New Roman" w:hAnsi="Times New Roman"/>
+        </w:rPr>
+      </w:pPr>
+      <w:bookmarkStart w:colFirst="0" w:colLast="0" w:name="_dlkip1009" w:id="1009"/>
+      <w:bookmarkEnd w:id="1009"/>
       <w:r>
         <w:rPr>
           <w:rFonts w:ascii="Times New Roman" w:cs="Times New Roman" w:eastAsia="Times New Roman" w:hAnsi="Times New Roman"/>

</xml_diff>

<commit_message>
Variant 1: full Manokip partner description from client
Co-Authored-By: Claude Opus 5.5 <noreply@anthropic.com>
Claude-Session: https://claude.ai/code/session_01V2FjruK1JeG3yk1AXHn97V
</commit_message>
<xml_diff>
--- a/dlkip_brandbook/out/40'0'0 БРЕНДБУК DLKIP (вариант 1 - как у Домалогики).docx
+++ b/dlkip_brandbook/out/40'0'0 БРЕНДБУК DLKIP (вариант 1 - как у Домалогики).docx
@@ -686,9 +686,33 @@
       <w:r>
         <w:rPr>
           <w:rFonts w:ascii="Times New Roman" w:cs="Times New Roman" w:eastAsia="Times New Roman" w:hAnsi="Times New Roman"/>
-          <w:rtl w:val="0"/>
-        </w:rPr>
-        <w:t xml:space="preserve">Компания Manokip — крупнейший производитель манометров в Узбекистане, работающая с 2015 года.</w:t>
+          <w:b w:val="1"/>
+          <w:bCs w:val="1"/>
+          <w:rtl w:val="0"/>
+        </w:rPr>
+        <w:t xml:space="preserve">Manokip</w:t>
+      </w:r>
+      <w:r>
+        <w:rPr>
+          <w:rFonts w:ascii="Times New Roman" w:cs="Times New Roman" w:eastAsia="Times New Roman" w:hAnsi="Times New Roman"/>
+          <w:rtl w:val="0"/>
+        </w:rPr>
+        <w:t xml:space="preserve"> — крупнейший производитель манометров в Узбекистане. Компания занимается производством контрольно-измерительных приборов с 2018 года: производство и поставка манометров, термоманометров, вакуумметров, термометров, индикаторов давления, преобразователей давления и дополнительного оборудования.</w:t>
+      </w:r>
+    </w:p>
+    <w:p>
+      <w:pPr>
+        <w:spacing w:after="240" w:before="240" w:lineRule="auto"/>
+        <w:rPr>
+          <w:rFonts w:ascii="Times New Roman" w:cs="Times New Roman" w:eastAsia="Times New Roman" w:hAnsi="Times New Roman"/>
+        </w:rPr>
+      </w:pPr>
+      <w:r>
+        <w:rPr>
+          <w:rFonts w:ascii="Times New Roman" w:cs="Times New Roman" w:eastAsia="Times New Roman" w:hAnsi="Times New Roman"/>
+          <w:rtl w:val="0"/>
+        </w:rPr>
+        <w:t xml:space="preserve">Manokip обеспечивает качественную сборку и точную калибровку измерительных приборов, предлагает широкую линейку приборов и производство приборов под заказ. Собственный склад полуготовой продукции обеспечивает минимальные сроки поставки. Компания также предоставляет услуги ремонта и калибровки контрольно-измерительных приборов. Приборы Manokip можно купить в Ташкенте, а также в других крупных городах Узбекистана.</w:t>
       </w:r>
     </w:p>
     <w:p>

</xml_diff>

<commit_message>
Variant 1: add favicon and merch sections (client text)
Co-Authored-By: Claude Opus 5.5 <noreply@anthropic.com>
Claude-Session: https://claude.ai/code/session_01V2FjruK1JeG3yk1AXHn97V
</commit_message>
<xml_diff>
--- a/dlkip_brandbook/out/40'0'0 БРЕНДБУК DLKIP (вариант 1 - как у Домалогики).docx
+++ b/dlkip_brandbook/out/40'0'0 БРЕНДБУК DLKIP (вариант 1 - как у Домалогики).docx
@@ -11255,6 +11255,102 @@
         <w:rPr>
           <w:rtl w:val="0"/>
         </w:rPr>
+      </w:r>
+    </w:p>
+    <w:p>
+      <w:pPr>
+        <w:keepNext/>
+        <w:spacing w:after="240" w:before="240" w:lineRule="auto"/>
+        <w:rPr>
+          <w:rFonts w:ascii="Times New Roman" w:cs="Times New Roman" w:eastAsia="Times New Roman" w:hAnsi="Times New Roman"/>
+          <w:b w:val="1"/>
+          <w:bCs w:val="1"/>
+        </w:rPr>
+      </w:pPr>
+      <w:r>
+        <w:rPr>
+          <w:rFonts w:ascii="Times New Roman" w:cs="Times New Roman" w:eastAsia="Times New Roman" w:hAnsi="Times New Roman"/>
+          <w:b w:val="1"/>
+          <w:bCs w:val="1"/>
+          <w:rtl w:val="0"/>
+        </w:rPr>
+        <w:t xml:space="preserve">ФАВИКОН</w:t>
+      </w:r>
+    </w:p>
+    <w:p>
+      <w:pPr>
+        <w:spacing w:after="240" w:before="240" w:lineRule="auto"/>
+        <w:rPr>
+          <w:rFonts w:ascii="Times New Roman" w:cs="Times New Roman" w:eastAsia="Times New Roman" w:hAnsi="Times New Roman"/>
+        </w:rPr>
+      </w:pPr>
+      <w:r>
+        <w:rPr>
+          <w:rFonts w:ascii="Times New Roman" w:cs="Times New Roman" w:eastAsia="Times New Roman" w:hAnsi="Times New Roman"/>
+          <w:rtl w:val="0"/>
+        </w:rPr>
+        <w:t xml:space="preserve">Фавикон - это маленькая иконка сайта, которая видна во вкладке браузера рядом с названием страницы (размером 16–32 пикселя). Для неё берётся только знак логотипа, без надписи, поэтому знак должен хорошо читаться даже совсем маленьким.</w:t>
+      </w:r>
+    </w:p>
+    <w:p>
+      <w:pPr>
+        <w:spacing w:after="0" w:before="0" w:lineRule="auto"/>
+        <w:rPr>
+          <w:rFonts w:ascii="Times New Roman" w:cs="Times New Roman" w:eastAsia="Times New Roman" w:hAnsi="Times New Roman"/>
+        </w:rPr>
+      </w:pPr>
+      <w:r>
+        <w:pict>
+          <v:rect style="width:0.0pt;height:1.5pt" o:hr="t" o:hrstd="t" o:hralign="center" fillcolor="#A0A0A0" stroked="f"/>
+        </w:pict>
+      </w:r>
+    </w:p>
+    <w:p>
+      <w:pPr>
+        <w:keepNext/>
+        <w:spacing w:after="240" w:before="240" w:lineRule="auto"/>
+        <w:rPr>
+          <w:rFonts w:ascii="Times New Roman" w:cs="Times New Roman" w:eastAsia="Times New Roman" w:hAnsi="Times New Roman"/>
+          <w:b w:val="1"/>
+          <w:bCs w:val="1"/>
+        </w:rPr>
+      </w:pPr>
+      <w:r>
+        <w:rPr>
+          <w:rFonts w:ascii="Times New Roman" w:cs="Times New Roman" w:eastAsia="Times New Roman" w:hAnsi="Times New Roman"/>
+          <w:b w:val="1"/>
+          <w:bCs w:val="1"/>
+          <w:rtl w:val="0"/>
+        </w:rPr>
+        <w:t xml:space="preserve">МЕРЧ</w:t>
+      </w:r>
+    </w:p>
+    <w:p>
+      <w:pPr>
+        <w:spacing w:after="240" w:before="240" w:lineRule="auto"/>
+        <w:rPr>
+          <w:rFonts w:ascii="Times New Roman" w:cs="Times New Roman" w:eastAsia="Times New Roman" w:hAnsi="Times New Roman"/>
+        </w:rPr>
+      </w:pPr>
+      <w:r>
+        <w:rPr>
+          <w:rFonts w:ascii="Times New Roman" w:cs="Times New Roman" w:eastAsia="Times New Roman" w:hAnsi="Times New Roman"/>
+          <w:rtl w:val="0"/>
+        </w:rPr>
+        <w:t xml:space="preserve">Мерч - это фирменные вещи с логотипом компании: футболки, худи, кепки, кружки, ручки, блокноты, пакеты, спецодежда для сотрудников. Их дарят клиентам и партнёрам или носят сотрудники.</w:t>
+      </w:r>
+    </w:p>
+    <w:p>
+      <w:pPr>
+        <w:spacing w:after="0" w:before="0" w:lineRule="auto"/>
+        <w:rPr>
+          <w:rFonts w:ascii="Times New Roman" w:cs="Times New Roman" w:eastAsia="Times New Roman" w:hAnsi="Times New Roman"/>
+        </w:rPr>
+      </w:pPr>
+      <w:r>
+        <w:pict>
+          <v:rect style="width:0.0pt;height:1.5pt" o:hr="t" o:hrstd="t" o:hralign="center" fillcolor="#A0A0A0" stroked="f"/>
+        </w:pict>
       </w:r>
     </w:p>
     <w:p>

</xml_diff>